<commit_message>
Revise report: fix abstract sentence, correct Phase 16 verdict, restore matched-frequency qualifier
</commit_message>
<xml_diff>
--- a/docs/ICT_Research_Report.docx
+++ b/docs/ICT_Research_Report.docx
@@ -269,7 +269,7 @@
           <w:szCs w:val="21"/>
           <w:rtl w:val="0"/>
         </w:rPr>
-        <w:t xml:space="preserve"> selection-bias-corrected Sharpe of approximately 0.2 (statistically indistinguishable from zero), with no measurable edge at all in the most recent 3.5 years. A </w:t>
+        <w:t xml:space="preserve"> to a selection-bias-corrected Sharpe of approximately 0.2 (statistically indistinguishable from zero), with no measurable edge at all in the most recent 3.5 years. A </w:t>
       </w:r>
       <w:r>
         <w:rPr>
@@ -2640,7 +2640,70 @@
                 <w:szCs w:val="18"/>
                 <w:rtl w:val="0"/>
               </w:rPr>
-              <w:t xml:space="preserve">Five enhancements (decay, BE, ensemble, interactions, pruning)</w:t>
+              <w:t xml:space="preserve">Five enhancements (time</w:t>
+            </w:r>
+            <w:r>
+              <w:rPr>
+                <w:color w:val="222222"/>
+                <w:sz w:val="18"/>
+                <w:szCs w:val="18"/>
+                <w:rtl w:val="0"/>
+              </w:rPr>
+              <w:t xml:space="preserve">-</w:t>
+            </w:r>
+            <w:r>
+              <w:rPr>
+                <w:rFonts w:ascii="Calibri" w:cs="Calibri" w:eastAsia="Calibri" w:hAnsi="Calibri"/>
+                <w:b w:val="0"/>
+                <w:bCs w:val="0"/>
+                <w:color w:val="222222"/>
+                <w:sz w:val="18"/>
+                <w:szCs w:val="18"/>
+                <w:rtl w:val="0"/>
+              </w:rPr>
+              <w:t xml:space="preserve">decay weighting, </w:t>
+            </w:r>
+            <w:r>
+              <w:rPr>
+                <w:color w:val="222222"/>
+                <w:sz w:val="18"/>
+                <w:szCs w:val="18"/>
+                <w:rtl w:val="0"/>
+              </w:rPr>
+              <w:t xml:space="preserve">moving stop-loss to break-even</w:t>
+            </w:r>
+            <w:r>
+              <w:rPr>
+                <w:rFonts w:ascii="Calibri" w:cs="Calibri" w:eastAsia="Calibri" w:hAnsi="Calibri"/>
+                <w:b w:val="0"/>
+                <w:bCs w:val="0"/>
+                <w:color w:val="222222"/>
+                <w:sz w:val="18"/>
+                <w:szCs w:val="18"/>
+                <w:rtl w:val="0"/>
+              </w:rPr>
+              <w:t xml:space="preserve">, ensemble of d</w:t>
+            </w:r>
+            <w:r>
+              <w:rPr>
+                <w:color w:val="222222"/>
+                <w:sz w:val="18"/>
+                <w:szCs w:val="18"/>
+                <w:rtl w:val="0"/>
+              </w:rPr>
+              <w:t xml:space="preserve">ifferent LightGBM seeds</w:t>
+            </w:r>
+            <w:r>
+              <w:rPr>
+                <w:rFonts w:ascii="Calibri" w:cs="Calibri" w:eastAsia="Calibri" w:hAnsi="Calibri"/>
+                <w:b w:val="0"/>
+                <w:bCs w:val="0"/>
+                <w:color w:val="222222"/>
+                <w:sz w:val="18"/>
+                <w:szCs w:val="18"/>
+                <w:rtl w:val="0"/>
+              </w:rPr>
+              <w:t xml:space="preserve">, feature interactions/complex signals, pruning unnecessary features)</w:t>
             </w:r>
             <w:r>
               <w:rPr>
@@ -2892,16 +2955,18 @@
           <w:p>
             <w:pPr>
               <w:jc w:val="center"/>
-              <w:rPr/>
+              <w:rPr>
+                <w:color w:val="888888"/>
+              </w:rPr>
             </w:pPr>
             <w:r>
               <w:rPr>
-                <w:color w:val="994444"/>
-                <w:sz w:val="18"/>
-                <w:szCs w:val="18"/>
-                <w:rtl w:val="0"/>
-              </w:rPr>
-              <w:t xml:space="preserve">Failed - lower Sharpe</w:t>
+                <w:color w:val="888888"/>
+                <w:sz w:val="18"/>
+                <w:szCs w:val="18"/>
+                <w:rtl w:val="0"/>
+              </w:rPr>
+              <w:t xml:space="preserve">Planned, never completed</w:t>
             </w:r>
             <w:r>
               <w:rPr>
@@ -3381,12 +3446,12 @@
           <wp:inline distB="0" distT="0" distL="0" distR="0">
             <wp:extent cx="6096000" cy="2743200"/>
             <wp:effectExtent b="0" l="0" r="0" t="0"/>
-            <wp:docPr id="1" name="image4.png"/>
+            <wp:docPr id="1" name="image1.png"/>
             <a:graphic>
               <a:graphicData uri="http://schemas.openxmlformats.org/drawingml/2006/picture">
                 <pic:pic>
                   <pic:nvPicPr>
-                    <pic:cNvPr id="0" name="image4.png"/>
+                    <pic:cNvPr id="0" name="image1.png"/>
                     <pic:cNvPicPr preferRelativeResize="0"/>
                   </pic:nvPicPr>
                   <pic:blipFill>
@@ -4671,12 +4736,12 @@
           <wp:inline distB="0" distT="0" distL="0" distR="0">
             <wp:extent cx="6096000" cy="2743200"/>
             <wp:effectExtent b="0" l="0" r="0" t="0"/>
-            <wp:docPr id="3" name="image3.png"/>
+            <wp:docPr id="3" name="image4.png"/>
             <a:graphic>
               <a:graphicData uri="http://schemas.openxmlformats.org/drawingml/2006/picture">
                 <pic:pic>
                   <pic:nvPicPr>
-                    <pic:cNvPr id="0" name="image3.png"/>
+                    <pic:cNvPr id="0" name="image4.png"/>
                     <pic:cNvPicPr preferRelativeResize="0"/>
                   </pic:nvPicPr>
                   <pic:blipFill>
@@ -4877,7 +4942,7 @@
           <w:szCs w:val="21"/>
           <w:rtl w:val="0"/>
         </w:rPr>
-        <w:t xml:space="preserve">, trained on identical data through the identical walk-forward, produced only ~4.5%/yr gross versus the reported 17.7% of the best configuration. A deployable edge should be a property of the strategy and data, not of </w:t>
+        <w:t xml:space="preserve">, trained on identical data through the identical walk-forward, produced only ~4.5%/yr gross over a similar number of trades versus the reported 17.7% of the best configuration. A deployable edge should be a property of the strategy and data, not of </w:t>
       </w:r>
       <w:r>
         <w:rPr>
@@ -5146,12 +5211,12 @@
           <wp:inline distB="0" distT="0" distL="0" distR="0">
             <wp:extent cx="6096000" cy="2438400"/>
             <wp:effectExtent b="0" l="0" r="0" t="0"/>
-            <wp:docPr id="5" name="image1.png"/>
+            <wp:docPr id="5" name="image5.png"/>
             <a:graphic>
               <a:graphicData uri="http://schemas.openxmlformats.org/drawingml/2006/picture">
                 <pic:pic>
                   <pic:nvPicPr>
-                    <pic:cNvPr id="0" name="image1.png"/>
+                    <pic:cNvPr id="0" name="image5.png"/>
                     <pic:cNvPicPr preferRelativeResize="0"/>
                   </pic:nvPicPr>
                   <pic:blipFill>
@@ -5503,12 +5568,12 @@
           <wp:inline distB="0" distT="0" distL="0" distR="0">
             <wp:extent cx="6096000" cy="2743200"/>
             <wp:effectExtent b="0" l="0" r="0" t="0"/>
-            <wp:docPr id="4" name="image5.png"/>
+            <wp:docPr id="4" name="image3.png"/>
             <a:graphic>
               <a:graphicData uri="http://schemas.openxmlformats.org/drawingml/2006/picture">
                 <pic:pic>
                   <pic:nvPicPr>
-                    <pic:cNvPr id="0" name="image5.png"/>
+                    <pic:cNvPr id="0" name="image3.png"/>
                     <pic:cNvPicPr preferRelativeResize="0"/>
                   </pic:nvPicPr>
                   <pic:blipFill>

</xml_diff>